<commit_message>
Clarify Round 2 email verification flow
</commit_message>
<xml_diff>
--- a/public/downloads/capitol-ledger-round-2-beta-tester-guide.docx
+++ b/public/downloads/capitol-ledger-round-2-beta-tester-guide.docx
@@ -230,7 +230,7 @@
                 <w:color w:val="0F172A"/>
                 <w:sz w:val="21"/>
               </w:rPr>
-              <w:t>Use test-safe information and an email inbox you can access for account verification.</w:t>
+              <w:t>Use test-safe information and an email inbox you can access. Capitol Ledger will email a verification link, and testers should use it before signing back in.</w:t>
             </w:r>
           </w:p>
         </w:tc>
@@ -371,7 +371,7 @@
           <w:color w:val="0F172A"/>
           <w:sz w:val="22"/>
         </w:rPr>
-        <w:t>For account creation, use an email inbox you can access. Capitol Ledger may send a verification link, and you will need that inbox to complete the account flow.</w:t>
+        <w:t>For account creation, use an email inbox you can access. Capitol Ledger sends a verification link during sign-up. Open that link from your email, then return to Capitol Ledger and sign back in with the verified account before continuing.</w:t>
       </w:r>
     </w:p>
     <w:p>
@@ -627,7 +627,25 @@
           <w:color w:val="0F172A"/>
           <w:sz w:val="22"/>
         </w:rPr>
-        <w:t>Complete any verification-email step.</w:t>
+        <w:t>Open the verification link emailed to you.</w:t>
+      </w:r>
+    </w:p>
+    <w:p>
+      <w:pPr>
+        <w:spacing w:before="0" w:after="80" w:line="300" w:lineRule="auto"/>
+        <w:numPr>
+          <w:ilvl w:val="0"/>
+          <w:numId w:val="11"/>
+        </w:numPr>
+        <w:ind w:left="540" w:hanging="271"/>
+      </w:pPr>
+      <w:r>
+        <w:rPr>
+          <w:rFonts w:ascii="Calibri" w:hAnsi="Calibri"/>
+          <w:color w:val="0F172A"/>
+          <w:sz w:val="22"/>
+        </w:rPr>
+        <w:t>Return to Capitol Ledger and sign back in with the verified email.</w:t>
       </w:r>
     </w:p>
     <w:p>

</xml_diff>

<commit_message>
Clarify returning tester Round 2 checks
</commit_message>
<xml_diff>
--- a/public/downloads/capitol-ledger-round-2-beta-tester-guide.docx
+++ b/public/downloads/capitol-ledger-round-2-beta-tester-guide.docx
@@ -230,7 +230,7 @@
                 <w:color w:val="0F172A"/>
                 <w:sz w:val="21"/>
               </w:rPr>
-              <w:t>Use test-safe information and an email inbox you can access. Capitol Ledger will email a verification link, and testers should use it before signing back in.</w:t>
+              <w:t>New testers should use an inbox they can access for the verification link. Returning Round 1 testers should sign in with their already verified account and check profile and gamification persistence.</w:t>
             </w:r>
           </w:p>
         </w:tc>
@@ -371,7 +371,20 @@
           <w:color w:val="0F172A"/>
           <w:sz w:val="22"/>
         </w:rPr>
-        <w:t>For account creation, use an email inbox you can access. Capitol Ledger sends a verification link during sign-up. Open that link from your email, then return to Capitol Ledger and sign back in with the verified account before continuing.</w:t>
+        <w:t>New testers should use an email inbox they can access. Capitol Ledger sends a verification link during sign-up. Open that link from your email, then return to Capitol Ledger and sign back in with the verified account before continuing.</w:t>
+      </w:r>
+    </w:p>
+    <w:p>
+      <w:pPr>
+        <w:spacing w:before="0" w:after="120" w:line="300" w:lineRule="auto"/>
+      </w:pPr>
+      <w:r>
+        <w:rPr>
+          <w:rFonts w:ascii="Calibri" w:hAnsi="Calibri"/>
+          <w:color w:val="0F172A"/>
+          <w:sz w:val="22"/>
+        </w:rPr>
+        <w:t>Returning Round 1 testers should sign in with the same account they already verified. Do not create a new account unless you are intentionally testing first-time setup again.</w:t>
       </w:r>
     </w:p>
     <w:p>
@@ -423,7 +436,7 @@
           <w:color w:val="0F172A"/>
           <w:sz w:val="22"/>
         </w:rPr>
-        <w:t>Account creation, email verification, sign-out, and sign-back-in.</w:t>
+        <w:t>New-tester account creation, email verification, sign-out, and sign-back-in.</w:t>
       </w:r>
     </w:p>
     <w:p>
@@ -441,7 +454,25 @@
           <w:color w:val="0F172A"/>
           <w:sz w:val="22"/>
         </w:rPr>
-        <w:t>Whether your district, interests, saved bills, saved officials, alerts, score, badges, and settings stay consistent after returning.</w:t>
+        <w:t>Returning Round 1 tester sign-in, without creating a new account or repeating verification.</w:t>
+      </w:r>
+    </w:p>
+    <w:p>
+      <w:pPr>
+        <w:spacing w:before="0" w:after="80" w:line="300" w:lineRule="auto"/>
+        <w:numPr>
+          <w:ilvl w:val="0"/>
+          <w:numId w:val="10"/>
+        </w:numPr>
+        <w:ind w:left="540" w:hanging="271"/>
+      </w:pPr>
+      <w:r>
+        <w:rPr>
+          <w:rFonts w:ascii="Calibri" w:hAnsi="Calibri"/>
+          <w:color w:val="0F172A"/>
+          <w:sz w:val="22"/>
+        </w:rPr>
+        <w:t>Whether your district, affiliation if set, interests, saved bills, saved officials, alerts, score, badges, days logged in, and settings stay consistent after returning.</w:t>
       </w:r>
     </w:p>
     <w:p>
@@ -712,7 +743,7 @@
           <w:color w:val="0F172A"/>
           <w:sz w:val="22"/>
         </w:rPr>
-        <w:t>Confirm your profile, district, saved items, and settings still make sense.</w:t>
+        <w:t>Confirm your previous profile choices stayed in place, including district, affiliation if set, policy interests, alert preferences, and saved items.</w:t>
       </w:r>
     </w:p>
     <w:p>
@@ -730,7 +761,25 @@
           <w:color w:val="0F172A"/>
           <w:sz w:val="22"/>
         </w:rPr>
-        <w:t>Report anything that reset unexpectedly.</w:t>
+        <w:t>Open Profile, Badges, or Impact and check that gamification still makes sense, especially civic score, badges, saved activity, and days logged in.</w:t>
+      </w:r>
+    </w:p>
+    <w:p>
+      <w:pPr>
+        <w:spacing w:before="0" w:after="80" w:line="300" w:lineRule="auto"/>
+        <w:numPr>
+          <w:ilvl w:val="0"/>
+          <w:numId w:val="12"/>
+        </w:numPr>
+        <w:ind w:left="540" w:hanging="271"/>
+      </w:pPr>
+      <w:r>
+        <w:rPr>
+          <w:rFonts w:ascii="Calibri" w:hAnsi="Calibri"/>
+          <w:color w:val="0F172A"/>
+          <w:sz w:val="22"/>
+        </w:rPr>
+        <w:t>Report anything that reset unexpectedly or did not update after this login.</w:t>
       </w:r>
     </w:p>
     <w:p>
@@ -944,7 +993,7 @@
           <w:color w:val="0F172A"/>
           <w:sz w:val="22"/>
         </w:rPr>
-        <w:t>Confirm civic score, badges, saved ledger counts, district, interests, and preferences match the actions you took.</w:t>
+        <w:t>Confirm civic score, badges, days logged in, saved ledger counts, district, interests, and preferences match the actions you took.</w:t>
       </w:r>
     </w:p>
     <w:p>
@@ -1237,6 +1286,42 @@
           <w:sz w:val="22"/>
         </w:rPr>
         <w:t>"I signed out and came back, but my district changed."</w:t>
+      </w:r>
+    </w:p>
+    <w:p>
+      <w:pPr>
+        <w:spacing w:before="0" w:after="80" w:line="300" w:lineRule="auto"/>
+        <w:numPr>
+          <w:ilvl w:val="0"/>
+          <w:numId w:val="17"/>
+        </w:numPr>
+        <w:ind w:left="540" w:hanging="271"/>
+      </w:pPr>
+      <w:r>
+        <w:rPr>
+          <w:rFonts w:ascii="Calibri" w:hAnsi="Calibri"/>
+          <w:color w:val="0F172A"/>
+          <w:sz w:val="22"/>
+        </w:rPr>
+        <w:t>"I was a Round 1 tester, but my interests or affiliation reset."</w:t>
+      </w:r>
+    </w:p>
+    <w:p>
+      <w:pPr>
+        <w:spacing w:before="0" w:after="80" w:line="300" w:lineRule="auto"/>
+        <w:numPr>
+          <w:ilvl w:val="0"/>
+          <w:numId w:val="17"/>
+        </w:numPr>
+        <w:ind w:left="540" w:hanging="271"/>
+      </w:pPr>
+      <w:r>
+        <w:rPr>
+          <w:rFonts w:ascii="Calibri" w:hAnsi="Calibri"/>
+          <w:color w:val="0F172A"/>
+          <w:sz w:val="22"/>
+        </w:rPr>
+        <w:t>"Days logged in did not update or looked wrong after I signed back in."</w:t>
       </w:r>
     </w:p>
     <w:p>
@@ -1571,7 +1656,43 @@
           <w:color w:val="0F172A"/>
           <w:sz w:val="22"/>
         </w:rPr>
+        <w:t>returning from Round 1,</w:t>
+      </w:r>
+    </w:p>
+    <w:p>
+      <w:pPr>
+        <w:spacing w:before="0" w:after="80" w:line="300" w:lineRule="auto"/>
+        <w:numPr>
+          <w:ilvl w:val="0"/>
+          <w:numId w:val="19"/>
+        </w:numPr>
+        <w:ind w:left="540" w:hanging="271"/>
+      </w:pPr>
+      <w:r>
+        <w:rPr>
+          <w:rFonts w:ascii="Calibri" w:hAnsi="Calibri"/>
+          <w:color w:val="0F172A"/>
+          <w:sz w:val="22"/>
+        </w:rPr>
         <w:t>checking persistence,</w:t>
+      </w:r>
+    </w:p>
+    <w:p>
+      <w:pPr>
+        <w:spacing w:before="0" w:after="80" w:line="300" w:lineRule="auto"/>
+        <w:numPr>
+          <w:ilvl w:val="0"/>
+          <w:numId w:val="19"/>
+        </w:numPr>
+        <w:ind w:left="540" w:hanging="271"/>
+      </w:pPr>
+      <w:r>
+        <w:rPr>
+          <w:rFonts w:ascii="Calibri" w:hAnsi="Calibri"/>
+          <w:color w:val="0F172A"/>
+          <w:sz w:val="22"/>
+        </w:rPr>
+        <w:t>checking days logged in, badges, or score,</w:t>
       </w:r>
     </w:p>
     <w:p>
@@ -1948,6 +2069,24 @@
           <w:sz w:val="22"/>
         </w:rPr>
         <w:t>The app remembered your setup and saved activity.</w:t>
+      </w:r>
+    </w:p>
+    <w:p>
+      <w:pPr>
+        <w:spacing w:before="0" w:after="80" w:line="300" w:lineRule="auto"/>
+        <w:numPr>
+          <w:ilvl w:val="0"/>
+          <w:numId w:val="22"/>
+        </w:numPr>
+        <w:ind w:left="540" w:hanging="271"/>
+      </w:pPr>
+      <w:r>
+        <w:rPr>
+          <w:rFonts w:ascii="Calibri" w:hAnsi="Calibri"/>
+          <w:color w:val="0F172A"/>
+          <w:sz w:val="22"/>
+        </w:rPr>
+        <w:t>Returning Round 1 accounts kept profile choices and showed reasonable gamification updates, including days logged in.</w:t>
       </w:r>
     </w:p>
     <w:p>

</xml_diff>